<commit_message>
added coursera and financial knowledge to pdf. added more clarification in titles to site.
</commit_message>
<xml_diff>
--- a/public/Resume.docx
+++ b/public/Resume.docx
@@ -1,10 +1,11 @@
 
 <file path=word/document.xml><?xml version="1.0" encoding="utf-8"?>
-<w:document xmlns:wpc="http://schemas.microsoft.com/office/word/2010/wordprocessingCanvas" xmlns:cx="http://schemas.microsoft.com/office/drawing/2014/chartex" xmlns:cx1="http://schemas.microsoft.com/office/drawing/2015/9/8/chartex" xmlns:cx2="http://schemas.microsoft.com/office/drawing/2015/10/21/chartex" xmlns:cx3="http://schemas.microsoft.com/office/drawing/2016/5/9/chartex" xmlns:cx4="http://schemas.microsoft.com/office/drawing/2016/5/10/chartex" xmlns:cx5="http://schemas.microsoft.com/office/drawing/2016/5/11/chartex" xmlns:cx6="http://schemas.microsoft.com/office/drawing/2016/5/12/chartex" xmlns:cx7="http://schemas.microsoft.com/office/drawing/2016/5/13/chartex" xmlns:cx8="http://schemas.microsoft.com/office/drawing/2016/5/14/chartex" xmlns:mc="http://schemas.openxmlformats.org/markup-compatibility/2006" xmlns:aink="http://schemas.microsoft.com/office/drawing/2016/ink" xmlns:am3d="http://schemas.microsoft.com/office/drawing/2017/model3d" xmlns:o="urn:schemas-microsoft-com:office:office" xmlns:oel="http://schemas.microsoft.com/office/2019/extlst" xmlns:r="http://schemas.openxmlformats.org/officeDocument/2006/relationships" xmlns:m="http://schemas.openxmlformats.org/officeDocument/2006/math" xmlns:v="urn:schemas-microsoft-com:vml" xmlns:wp14="http://schemas.microsoft.com/office/word/2010/wordprocessingDrawing" xmlns:wp="http://schemas.openxmlformats.org/drawingml/2006/wordprocessingDrawing" xmlns:w10="urn:schemas-microsoft-com:office:word" xmlns:w="http://schemas.openxmlformats.org/wordprocessingml/2006/main" xmlns:w14="http://schemas.microsoft.com/office/word/2010/wordml" xmlns:w15="http://schemas.microsoft.com/office/word/2012/wordml" xmlns:w16cex="http://schemas.microsoft.com/office/word/2018/wordml/cex" xmlns:w16cid="http://schemas.microsoft.com/office/word/2016/wordml/cid" xmlns:w16="http://schemas.microsoft.com/office/word/2018/wordml" xmlns:w16du="http://schemas.microsoft.com/office/word/2023/wordml/word16du" xmlns:w16sdtdh="http://schemas.microsoft.com/office/word/2020/wordml/sdtdatahash" xmlns:w16se="http://schemas.microsoft.com/office/word/2015/wordml/symex" xmlns:wpg="http://schemas.microsoft.com/office/word/2010/wordprocessingGroup" xmlns:wpi="http://schemas.microsoft.com/office/word/2010/wordprocessingInk" xmlns:wne="http://schemas.microsoft.com/office/word/2006/wordml" xmlns:wps="http://schemas.microsoft.com/office/word/2010/wordprocessingShape" mc:Ignorable="w14 w15 w16se w16cid w16 w16cex w16sdtdh w16du wp14">
+<w:document xmlns:wpc="http://schemas.microsoft.com/office/word/2010/wordprocessingCanvas" xmlns:cx="http://schemas.microsoft.com/office/drawing/2014/chartex" xmlns:cx1="http://schemas.microsoft.com/office/drawing/2015/9/8/chartex" xmlns:cx2="http://schemas.microsoft.com/office/drawing/2015/10/21/chartex" xmlns:cx3="http://schemas.microsoft.com/office/drawing/2016/5/9/chartex" xmlns:cx4="http://schemas.microsoft.com/office/drawing/2016/5/10/chartex" xmlns:cx5="http://schemas.microsoft.com/office/drawing/2016/5/11/chartex" xmlns:cx6="http://schemas.microsoft.com/office/drawing/2016/5/12/chartex" xmlns:cx7="http://schemas.microsoft.com/office/drawing/2016/5/13/chartex" xmlns:cx8="http://schemas.microsoft.com/office/drawing/2016/5/14/chartex" xmlns:mc="http://schemas.openxmlformats.org/markup-compatibility/2006" xmlns:aink="http://schemas.microsoft.com/office/drawing/2016/ink" xmlns:am3d="http://schemas.microsoft.com/office/drawing/2017/model3d" xmlns:o="urn:schemas-microsoft-com:office:office" xmlns:oel="http://schemas.microsoft.com/office/2019/extlst" xmlns:r="http://schemas.openxmlformats.org/officeDocument/2006/relationships" xmlns:m="http://schemas.openxmlformats.org/officeDocument/2006/math" xmlns:v="urn:schemas-microsoft-com:vml" xmlns:wp14="http://schemas.microsoft.com/office/word/2010/wordprocessingDrawing" xmlns:wp="http://schemas.openxmlformats.org/drawingml/2006/wordprocessingDrawing" xmlns:w10="urn:schemas-microsoft-com:office:word" xmlns:w="http://schemas.openxmlformats.org/wordprocessingml/2006/main" xmlns:w14="http://schemas.microsoft.com/office/word/2010/wordml" xmlns:w15="http://schemas.microsoft.com/office/word/2012/wordml" xmlns:w16cex="http://schemas.microsoft.com/office/word/2018/wordml/cex" xmlns:w16cid="http://schemas.microsoft.com/office/word/2016/wordml/cid" xmlns:w16="http://schemas.microsoft.com/office/word/2018/wordml" xmlns:w16du="http://schemas.microsoft.com/office/word/2023/wordml/word16du" xmlns:w16sdtdh="http://schemas.microsoft.com/office/word/2020/wordml/sdtdatahash" xmlns:w16sdtfl="http://schemas.microsoft.com/office/word/2024/wordml/sdtformatlock" xmlns:w16se="http://schemas.microsoft.com/office/word/2015/wordml/symex" xmlns:wpg="http://schemas.microsoft.com/office/word/2010/wordprocessingGroup" xmlns:wpi="http://schemas.microsoft.com/office/word/2010/wordprocessingInk" xmlns:wne="http://schemas.microsoft.com/office/word/2006/wordml" xmlns:wps="http://schemas.microsoft.com/office/word/2010/wordprocessingShape" mc:Ignorable="w14 w15 w16se w16cid w16 w16cex w16sdtdh w16sdtfl w16du wp14">
   <w:body>
     <w:p>
       <w:pPr>
         <w:pStyle w:val="Title"/>
+        <w:spacing w:before="0"/>
       </w:pPr>
       <w:r>
         <w:t>Seyed Amir Reza Mousavinezhad</w:t>
@@ -19,7 +20,7 @@
         <w:ind w:left="2250" w:right="2260"/>
         <w:jc w:val="center"/>
         <w:rPr>
-          <w:color w:val="0070C0"/>
+          <w:color w:val="548DD4" w:themeColor="text2" w:themeTint="99"/>
           <w:u w:val="single" w:color="0462C1"/>
         </w:rPr>
       </w:pPr>
@@ -51,49 +52,42 @@
         <w:r>
           <w:rPr>
             <w:rStyle w:val="Hyperlink"/>
-            <w:color w:val="0070C0"/>
+            <w:color w:val="548DD4" w:themeColor="text2" w:themeTint="99"/>
           </w:rPr>
           <w:t>s_ar_m@outlook.com</w:t>
         </w:r>
       </w:hyperlink>
       <w:r>
         <w:rPr>
-          <w:color w:val="0070C0"/>
+          <w:color w:val="548DD4" w:themeColor="text2" w:themeTint="99"/>
         </w:rPr>
         <w:t xml:space="preserve"> </w:t>
       </w:r>
       <w:hyperlink r:id="rId6">
         <w:r>
           <w:rPr>
-            <w:color w:val="0070C0"/>
+            <w:color w:val="548DD4" w:themeColor="text2" w:themeTint="99"/>
             <w:u w:val="single" w:color="0462C1"/>
           </w:rPr>
-          <w:t>linkedin.com/in/</w:t>
-        </w:r>
-        <w:r>
-          <w:rPr>
-            <w:color w:val="0070C0"/>
-            <w:u w:val="single" w:color="0462C1"/>
-          </w:rPr>
-          <w:t>sarm2001</w:t>
+          <w:t>linkedin.com/in/sarm2001</w:t>
         </w:r>
       </w:hyperlink>
       <w:r>
         <w:rPr>
-          <w:color w:val="0070C0"/>
+          <w:color w:val="548DD4" w:themeColor="text2" w:themeTint="99"/>
           <w:spacing w:val="-13"/>
         </w:rPr>
         <w:t xml:space="preserve"> </w:t>
       </w:r>
       <w:r>
         <w:rPr>
-          <w:color w:val="0070C0"/>
+          <w:color w:val="548DD4" w:themeColor="text2" w:themeTint="99"/>
         </w:rPr>
         <w:t>|</w:t>
       </w:r>
       <w:r>
         <w:rPr>
-          <w:color w:val="0070C0"/>
+          <w:color w:val="548DD4" w:themeColor="text2" w:themeTint="99"/>
           <w:spacing w:val="-12"/>
         </w:rPr>
         <w:t xml:space="preserve"> </w:t>
@@ -101,18 +95,20 @@
       <w:hyperlink r:id="rId7">
         <w:r>
           <w:rPr>
-            <w:color w:val="0070C0"/>
+            <w:color w:val="548DD4" w:themeColor="text2" w:themeTint="99"/>
             <w:u w:val="single" w:color="0462C1"/>
           </w:rPr>
           <w:t>github.com/</w:t>
         </w:r>
+        <w:proofErr w:type="spellStart"/>
         <w:r>
           <w:rPr>
-            <w:color w:val="0070C0"/>
+            <w:color w:val="548DD4" w:themeColor="text2" w:themeTint="99"/>
             <w:u w:val="single" w:color="0462C1"/>
           </w:rPr>
           <w:t>Axaerys</w:t>
         </w:r>
+        <w:proofErr w:type="spellEnd"/>
       </w:hyperlink>
     </w:p>
     <w:p>
@@ -122,29 +118,56 @@
         <w:ind w:left="0"/>
         <w:jc w:val="center"/>
         <w:rPr>
-          <w:color w:val="0070C0"/>
+          <w:color w:val="548DD4" w:themeColor="text2" w:themeTint="99"/>
+          <w:lang w:val="pt-PT"/>
         </w:rPr>
       </w:pPr>
       <w:r>
         <w:rPr>
           <w:color w:val="000000" w:themeColor="text1"/>
-        </w:rPr>
-        <w:t>Website:</w:t>
+          <w:lang w:val="pt-PT"/>
+        </w:rPr>
+        <w:t>Po</w:t>
       </w:r>
       <w:r>
         <w:rPr>
           <w:color w:val="000000" w:themeColor="text1"/>
-          <w:u w:val="single" w:color="0462C1"/>
+          <w:lang w:val="pt-PT"/>
+        </w:rPr>
+        <w:t>rtfolio</w:t>
+      </w:r>
+      <w:r>
+        <w:rPr>
+          <w:color w:val="000000" w:themeColor="text1"/>
+          <w:lang w:val="pt-PT"/>
+        </w:rPr>
+        <w:t xml:space="preserve"> (Web Dev)</w:t>
+      </w:r>
+      <w:r>
+        <w:rPr>
+          <w:color w:val="548DD4" w:themeColor="text2" w:themeTint="99"/>
+          <w:lang w:val="pt-PT"/>
+        </w:rPr>
+        <w:t>:</w:t>
+      </w:r>
+      <w:r>
+        <w:rPr>
+          <w:color w:val="548DD4" w:themeColor="text2" w:themeTint="99"/>
+          <w:u w:color="0462C1"/>
+          <w:lang w:val="pt-PT"/>
         </w:rPr>
         <w:t xml:space="preserve"> </w:t>
       </w:r>
-      <w:r>
-        <w:rPr>
-          <w:color w:val="0070C0"/>
-          <w:u w:val="single" w:color="0462C1"/>
-        </w:rPr>
-        <w:t>https://axaerys.github.io/PortfolioV3/</w:t>
-      </w:r>
+      <w:hyperlink r:id="rId8" w:history="1">
+        <w:r>
+          <w:rPr>
+            <w:rStyle w:val="Hyperlink"/>
+            <w:color w:val="548DD4" w:themeColor="text2" w:themeTint="99"/>
+            <w:lang w:val="pt-PT"/>
+          </w:rPr>
+          <w:t>https://axaerys.github.io/PortfolioV3/</w:t>
+        </w:r>
+      </w:hyperlink>
     </w:p>
     <w:p>
       <w:pPr>
@@ -250,7 +273,7 @@
           </mc:Choice>
           <mc:Fallback>
             <w:pict>
-              <v:group w14:anchorId="648465E1" id="Group 8" o:spid="_x0000_s1026" style="width:471.2pt;height:1.45pt;mso-position-horizontal-relative:char;mso-position-vertical-relative:line" coordsize="59842,184" o:gfxdata="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">
+              <v:group w14:anchorId="74B5C131" id="Group 8" o:spid="_x0000_s1026" style="width:471.2pt;height:1.45pt;mso-position-horizontal-relative:char;mso-position-vertical-relative:line" coordsize="59842,184" o:gfxdata="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">
                 <v:shape id="Graphic 9" o:spid="_x0000_s1027" style="position:absolute;width:59842;height:184;visibility:visible;mso-wrap-style:square;v-text-anchor:top" coordsize="5984240,18415" o:gfxdata="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" path="m5983859,l,,,18287r5983859,l5983859,xe" fillcolor="black" stroked="f">
                   <v:path arrowok="t"/>
                 </v:shape>
@@ -276,39 +299,238 @@
           <w:b/>
           <w:sz w:val="20"/>
         </w:rPr>
-        <w:t>Bachelor of Computer Science</w:t>
+        <w:t xml:space="preserve">Masters of Computer Science </w:t>
       </w:r>
       <w:r>
         <w:rPr>
           <w:b/>
           <w:sz w:val="20"/>
         </w:rPr>
+        <w:tab/>
+      </w:r>
+      <w:r>
+        <w:rPr>
+          <w:sz w:val="20"/>
+        </w:rPr>
+        <w:t>2025 – To Date</w:t>
+      </w:r>
+    </w:p>
+    <w:p>
+      <w:pPr>
+        <w:spacing w:after="240"/>
+        <w:ind w:left="140"/>
+        <w:rPr>
+          <w:i/>
+          <w:sz w:val="20"/>
+        </w:rPr>
+      </w:pPr>
+      <w:r>
+        <w:rPr>
+          <w:i/>
+          <w:sz w:val="20"/>
+        </w:rPr>
+        <w:t>University</w:t>
+      </w:r>
+      <w:r>
+        <w:rPr>
+          <w:i/>
+          <w:spacing w:val="-13"/>
+          <w:sz w:val="20"/>
+        </w:rPr>
         <w:t xml:space="preserve"> </w:t>
       </w:r>
       <w:r>
         <w:rPr>
+          <w:i/>
+          <w:sz w:val="20"/>
+        </w:rPr>
+        <w:t>of</w:t>
+      </w:r>
+      <w:r>
+        <w:rPr>
+          <w:i/>
+          <w:spacing w:val="-11"/>
+          <w:sz w:val="20"/>
+        </w:rPr>
+        <w:t xml:space="preserve"> </w:t>
+      </w:r>
+      <w:r>
+        <w:rPr>
+          <w:i/>
+          <w:sz w:val="20"/>
+        </w:rPr>
+        <w:t>Herriot-Watt |</w:t>
+      </w:r>
+      <w:r>
+        <w:rPr>
+          <w:i/>
+          <w:spacing w:val="-8"/>
+          <w:sz w:val="20"/>
+        </w:rPr>
+        <w:t xml:space="preserve"> </w:t>
+      </w:r>
+      <w:r>
+        <w:rPr>
+          <w:i/>
+          <w:sz w:val="20"/>
+        </w:rPr>
+        <w:t>Edinburgh</w:t>
+      </w:r>
+      <w:r>
+        <w:rPr>
+          <w:i/>
+          <w:sz w:val="20"/>
+        </w:rPr>
+        <w:t>,</w:t>
+      </w:r>
+      <w:r>
+        <w:rPr>
+          <w:i/>
+          <w:spacing w:val="-10"/>
+          <w:sz w:val="20"/>
+        </w:rPr>
+        <w:t xml:space="preserve"> </w:t>
+      </w:r>
+      <w:r>
+        <w:rPr>
+          <w:i/>
+          <w:spacing w:val="-5"/>
+          <w:sz w:val="20"/>
+        </w:rPr>
+        <w:t>UK</w:t>
+      </w:r>
+    </w:p>
+    <w:p>
+      <w:pPr>
+        <w:tabs>
+          <w:tab w:val="right" w:pos="9450"/>
+        </w:tabs>
+        <w:ind w:left="144" w:right="100"/>
+        <w:rPr>
+          <w:sz w:val="20"/>
+        </w:rPr>
+      </w:pPr>
+      <w:r>
+        <w:rPr>
           <w:b/>
           <w:sz w:val="20"/>
         </w:rPr>
+        <w:t xml:space="preserve">Online Courses </w:t>
+      </w:r>
+      <w:r>
+        <w:rPr>
+          <w:b/>
+          <w:sz w:val="20"/>
+        </w:rPr>
         <w:tab/>
       </w:r>
       <w:r>
         <w:rPr>
           <w:sz w:val="20"/>
         </w:rPr>
-        <w:t>Ju</w:t>
-      </w:r>
-      <w:r>
-        <w:rPr>
-          <w:sz w:val="20"/>
-        </w:rPr>
-        <w:t>l</w:t>
-      </w:r>
-      <w:r>
-        <w:rPr>
-          <w:sz w:val="20"/>
-        </w:rPr>
-        <w:t>y 2023</w:t>
+        <w:t xml:space="preserve">2023 </w:t>
+      </w:r>
+      <w:bookmarkStart w:id="0" w:name="_Hlk196325725"/>
+      <w:r>
+        <w:rPr>
+          <w:sz w:val="20"/>
+        </w:rPr>
+        <w:t xml:space="preserve">– </w:t>
+      </w:r>
+      <w:bookmarkEnd w:id="0"/>
+      <w:r>
+        <w:rPr>
+          <w:sz w:val="20"/>
+        </w:rPr>
+        <w:t>To Date</w:t>
+      </w:r>
+    </w:p>
+    <w:p>
+      <w:pPr>
+        <w:tabs>
+          <w:tab w:val="right" w:pos="9450"/>
+        </w:tabs>
+        <w:spacing w:after="240"/>
+        <w:ind w:left="144" w:right="100"/>
+        <w:rPr>
+          <w:i/>
+          <w:sz w:val="20"/>
+        </w:rPr>
+      </w:pPr>
+      <w:r>
+        <w:rPr>
+          <w:i/>
+          <w:sz w:val="20"/>
+        </w:rPr>
+        <w:t xml:space="preserve">YouTube, </w:t>
+      </w:r>
+      <w:r>
+        <w:rPr>
+          <w:i/>
+          <w:sz w:val="20"/>
+        </w:rPr>
+        <w:t xml:space="preserve">Coursera, </w:t>
+      </w:r>
+      <w:r>
+        <w:rPr>
+          <w:i/>
+          <w:sz w:val="20"/>
+        </w:rPr>
+        <w:t>etc.</w:t>
+      </w:r>
+    </w:p>
+    <w:p>
+      <w:pPr>
+        <w:tabs>
+          <w:tab w:val="right" w:pos="9450"/>
+        </w:tabs>
+        <w:ind w:left="144" w:right="100"/>
+        <w:rPr>
+          <w:bCs/>
+          <w:sz w:val="20"/>
+        </w:rPr>
+      </w:pPr>
+      <w:r>
+        <w:rPr>
+          <w:b/>
+          <w:sz w:val="20"/>
+        </w:rPr>
+        <w:t xml:space="preserve">Bachelor of Computer Science </w:t>
+      </w:r>
+      <w:r>
+        <w:rPr>
+          <w:b/>
+          <w:sz w:val="20"/>
+        </w:rPr>
+        <w:tab/>
+      </w:r>
+      <w:r>
+        <w:rPr>
+          <w:bCs/>
+          <w:sz w:val="20"/>
+        </w:rPr>
+        <w:t xml:space="preserve">2020 </w:t>
+      </w:r>
+      <w:r>
+        <w:rPr>
+          <w:bCs/>
+          <w:sz w:val="20"/>
+        </w:rPr>
+        <w:t>–</w:t>
+      </w:r>
+      <w:r>
+        <w:rPr>
+          <w:bCs/>
+          <w:sz w:val="20"/>
+        </w:rPr>
+        <w:t xml:space="preserve"> </w:t>
+      </w:r>
+      <w:r>
+        <w:rPr>
+          <w:bCs/>
+          <w:sz w:val="20"/>
+        </w:rPr>
+        <w:t>2023</w:t>
       </w:r>
     </w:p>
     <w:p>
@@ -330,10 +552,13 @@
     </w:p>
     <w:p>
       <w:pPr>
+        <w:tabs>
+          <w:tab w:val="right" w:pos="9450"/>
+        </w:tabs>
         <w:spacing w:after="240"/>
-        <w:ind w:left="140"/>
-        <w:rPr>
-          <w:i/>
+        <w:ind w:left="144" w:right="100"/>
+        <w:rPr>
+          <w:iCs/>
           <w:sz w:val="20"/>
         </w:rPr>
       </w:pPr>
@@ -372,21 +597,7 @@
           <w:i/>
           <w:sz w:val="20"/>
         </w:rPr>
-        <w:t>Wollongong</w:t>
-      </w:r>
-      <w:r>
-        <w:rPr>
-          <w:i/>
-          <w:sz w:val="20"/>
-        </w:rPr>
-        <w:t xml:space="preserve"> </w:t>
-      </w:r>
-      <w:r>
-        <w:rPr>
-          <w:i/>
-          <w:sz w:val="20"/>
-        </w:rPr>
-        <w:t>|</w:t>
+        <w:t>Wollongong |</w:t>
       </w:r>
       <w:r>
         <w:rPr>
@@ -401,7 +612,14 @@
           <w:i/>
           <w:sz w:val="20"/>
         </w:rPr>
-        <w:t>Dubai,</w:t>
+        <w:t>Wollongong</w:t>
+      </w:r>
+      <w:r>
+        <w:rPr>
+          <w:i/>
+          <w:sz w:val="20"/>
+        </w:rPr>
+        <w:t>,</w:t>
       </w:r>
       <w:r>
         <w:rPr>
@@ -414,10 +632,10 @@
       <w:r>
         <w:rPr>
           <w:i/>
-          <w:spacing w:val="-5"/>
-          <w:sz w:val="20"/>
-        </w:rPr>
-        <w:t>UAE</w:t>
+          <w:spacing w:val="-10"/>
+          <w:sz w:val="20"/>
+        </w:rPr>
+        <w:t>Australia</w:t>
       </w:r>
     </w:p>
     <w:p>
@@ -527,7 +745,7 @@
           </mc:Choice>
           <mc:Fallback>
             <w:pict>
-              <v:group w14:anchorId="107A71A2" id="Group 1" o:spid="_x0000_s1026" style="width:471.2pt;height:1.45pt;mso-position-horizontal-relative:char;mso-position-vertical-relative:line" coordsize="59842,184" o:gfxdata="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">
+              <v:group w14:anchorId="7D13B5AE" id="Group 1" o:spid="_x0000_s1026" style="width:471.2pt;height:1.45pt;mso-position-horizontal-relative:char;mso-position-vertical-relative:line" coordsize="59842,184" o:gfxdata="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">
                 <v:shape id="Graphic 2" o:spid="_x0000_s1027" style="position:absolute;width:59842;height:184;visibility:visible;mso-wrap-style:square;v-text-anchor:top" coordsize="5984240,18415" o:gfxdata="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" path="m5983859,l,,,18288r5983859,l5983859,xe" fillcolor="black" stroked="f">
                   <v:path arrowok="t"/>
                 </v:shape>
@@ -553,7 +771,14 @@
           <w:b/>
           <w:sz w:val="20"/>
         </w:rPr>
-        <w:t>Web Developer (Lead Front-End Programmer</w:t>
+        <w:t xml:space="preserve">Iceberg Financial </w:t>
+      </w:r>
+      <w:r>
+        <w:rPr>
+          <w:b/>
+          <w:sz w:val="20"/>
+        </w:rPr>
+        <w:t>(Lead Front-End Programmer</w:t>
       </w:r>
       <w:r>
         <w:rPr>
@@ -622,61 +847,6 @@
           <w:sz w:val="20"/>
         </w:rPr>
         <w:t>January 2024</w:t>
-      </w:r>
-    </w:p>
-    <w:p>
-      <w:pPr>
-        <w:spacing w:before="1"/>
-        <w:ind w:left="140"/>
-        <w:rPr>
-          <w:i/>
-          <w:sz w:val="20"/>
-        </w:rPr>
-      </w:pPr>
-      <w:r>
-        <w:rPr>
-          <w:i/>
-          <w:sz w:val="20"/>
-        </w:rPr>
-        <w:t>Iceberg Financial</w:t>
-      </w:r>
-      <w:r>
-        <w:rPr>
-          <w:i/>
-          <w:spacing w:val="-5"/>
-          <w:sz w:val="20"/>
-        </w:rPr>
-        <w:t xml:space="preserve"> </w:t>
-      </w:r>
-      <w:r>
-        <w:rPr>
-          <w:i/>
-          <w:sz w:val="20"/>
-        </w:rPr>
-        <w:t>|</w:t>
-      </w:r>
-      <w:r>
-        <w:rPr>
-          <w:i/>
-          <w:spacing w:val="-5"/>
-          <w:sz w:val="20"/>
-        </w:rPr>
-        <w:t xml:space="preserve"> </w:t>
-      </w:r>
-      <w:r>
-        <w:rPr>
-          <w:i/>
-          <w:sz w:val="20"/>
-        </w:rPr>
-        <w:t>Dubai,</w:t>
-      </w:r>
-      <w:r>
-        <w:rPr>
-          <w:i/>
-          <w:spacing w:val="-5"/>
-          <w:sz w:val="20"/>
-        </w:rPr>
-        <w:t xml:space="preserve"> UAE</w:t>
       </w:r>
     </w:p>
     <w:p>
@@ -922,7 +1092,7 @@
           </mc:Choice>
           <mc:Fallback>
             <w:pict>
-              <v:shape w14:anchorId="44D2D594" id="Graphic 3" o:spid="_x0000_s1026" style="position:absolute;margin-left:70.6pt;margin-top:12.25pt;width:471.2pt;height:1.45pt;z-index:-15728128;visibility:visible;mso-wrap-style:square;mso-wrap-distance-left:0;mso-wrap-distance-top:0;mso-wrap-distance-right:0;mso-wrap-distance-bottom:0;mso-position-horizontal:absolute;mso-position-horizontal-relative:page;mso-position-vertical:absolute;mso-position-vertical-relative:text;v-text-anchor:top" coordsize="5984240,18415" o:gfxdata="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" path="m5983859,l,,,18287r5983859,l5983859,xe" fillcolor="black" stroked="f">
+              <v:shape w14:anchorId="045D1D97" id="Graphic 3" o:spid="_x0000_s1026" style="position:absolute;margin-left:70.6pt;margin-top:12.25pt;width:471.2pt;height:1.45pt;z-index:-15728128;visibility:visible;mso-wrap-style:square;mso-wrap-distance-left:0;mso-wrap-distance-top:0;mso-wrap-distance-right:0;mso-wrap-distance-bottom:0;mso-position-horizontal:absolute;mso-position-horizontal-relative:page;mso-position-vertical:absolute;mso-position-vertical-relative:text;v-text-anchor:top" coordsize="5984240,18415" o:gfxdata="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" path="m5983859,l,,,18287r5983859,l5983859,xe" fillcolor="black" stroked="f">
                 <v:path arrowok="t"/>
                 <w10:wrap type="topAndBottom" anchorx="page"/>
               </v:shape>
@@ -934,24 +1104,10 @@
         <w:rPr>
           <w:noProof/>
         </w:rPr>
-        <w:t>Personal</w:t>
+        <w:t>Cyber Security</w:t>
       </w:r>
       <w:r>
         <w:t xml:space="preserve"> Projects</w:t>
-      </w:r>
-      <w:r>
-        <w:t xml:space="preserve"> </w:t>
-      </w:r>
-      <w:r>
-        <w:rPr>
-          <w:b w:val="0"/>
-          <w:bCs w:val="0"/>
-          <w:i/>
-          <w:iCs/>
-          <w:sz w:val="16"/>
-          <w:szCs w:val="16"/>
-        </w:rPr>
-        <w:t>(View project demos at my website linked at the top)</w:t>
       </w:r>
     </w:p>
     <w:p>
@@ -965,295 +1121,87 @@
           <w:sz w:val="20"/>
         </w:rPr>
       </w:pPr>
-      <w:proofErr w:type="spellStart"/>
       <w:r>
         <w:rPr>
           <w:b/>
           <w:spacing w:val="-2"/>
           <w:sz w:val="20"/>
         </w:rPr>
-        <w:t>AquaSerene</w:t>
+        <w:t>Decentralized</w:t>
+      </w:r>
+      <w:r>
+        <w:rPr>
+          <w:b/>
+          <w:spacing w:val="-2"/>
+          <w:sz w:val="20"/>
+        </w:rPr>
+        <w:t xml:space="preserve"> File </w:t>
+      </w:r>
+      <w:r>
+        <w:rPr>
+          <w:b/>
+          <w:spacing w:val="-2"/>
+          <w:sz w:val="20"/>
+        </w:rPr>
+        <w:t>S</w:t>
+      </w:r>
+      <w:r>
+        <w:rPr>
+          <w:b/>
+          <w:spacing w:val="-2"/>
+          <w:sz w:val="20"/>
+        </w:rPr>
+        <w:t xml:space="preserve">torage </w:t>
+      </w:r>
+      <w:r>
+        <w:rPr>
+          <w:b/>
+          <w:spacing w:val="-2"/>
+          <w:sz w:val="20"/>
+        </w:rPr>
+        <w:t>A</w:t>
+      </w:r>
+      <w:r>
+        <w:rPr>
+          <w:b/>
+          <w:spacing w:val="-2"/>
+          <w:sz w:val="20"/>
+        </w:rPr>
+        <w:t>pplication</w:t>
+      </w:r>
+    </w:p>
+    <w:p>
+      <w:pPr>
+        <w:spacing w:after="240" w:line="225" w:lineRule="exact"/>
+        <w:ind w:left="540"/>
+        <w:rPr>
+          <w:sz w:val="20"/>
+          <w:szCs w:val="24"/>
+        </w:rPr>
+      </w:pPr>
+      <w:r>
+        <w:rPr>
+          <w:sz w:val="20"/>
+          <w:szCs w:val="24"/>
+        </w:rPr>
+        <w:t xml:space="preserve">Developed a fully decentralized end-to-end file storage application leveraging IPFS and blockchain technology. The frontend was built using HTML and CSS, while the backend was implemented with ReactJS, Solidity, and </w:t>
+      </w:r>
+      <w:proofErr w:type="spellStart"/>
+      <w:r>
+        <w:rPr>
+          <w:sz w:val="20"/>
+          <w:szCs w:val="24"/>
+        </w:rPr>
+        <w:t>ElectronJS</w:t>
       </w:r>
       <w:proofErr w:type="spellEnd"/>
       <w:r>
         <w:rPr>
-          <w:b/>
-          <w:spacing w:val="14"/>
-          <w:sz w:val="20"/>
-        </w:rPr>
-        <w:t xml:space="preserve"> </w:t>
-      </w:r>
-      <w:r>
-        <w:rPr>
-          <w:spacing w:val="-2"/>
-          <w:sz w:val="20"/>
-        </w:rPr>
-        <w:t>|</w:t>
-      </w:r>
-      <w:r>
-        <w:rPr>
-          <w:spacing w:val="-2"/>
-          <w:sz w:val="20"/>
-        </w:rPr>
-        <w:t xml:space="preserve"> </w:t>
-      </w:r>
-      <w:r>
-        <w:rPr>
-          <w:spacing w:val="-2"/>
-          <w:sz w:val="20"/>
-        </w:rPr>
-        <w:t xml:space="preserve">Spa and Massage Business </w:t>
-      </w:r>
-      <w:r>
-        <w:rPr>
-          <w:spacing w:val="-2"/>
-          <w:sz w:val="18"/>
-          <w:szCs w:val="20"/>
-        </w:rPr>
-        <w:t>(fictional)</w:t>
-      </w:r>
-      <w:r>
-        <w:rPr>
-          <w:color w:val="0462C1"/>
-          <w:sz w:val="20"/>
-        </w:rPr>
-        <w:t xml:space="preserve"> </w:t>
-      </w:r>
-      <w:r>
-        <w:rPr>
-          <w:color w:val="0462C1"/>
-          <w:sz w:val="20"/>
-        </w:rPr>
-        <w:tab/>
-      </w:r>
-      <w:r>
-        <w:rPr>
-          <w:sz w:val="20"/>
-        </w:rPr>
-        <w:t>August</w:t>
-      </w:r>
-      <w:r>
-        <w:rPr>
-          <w:spacing w:val="-3"/>
-          <w:sz w:val="20"/>
-        </w:rPr>
-        <w:t xml:space="preserve"> </w:t>
-      </w:r>
-      <w:r>
-        <w:rPr>
-          <w:spacing w:val="-4"/>
-          <w:sz w:val="20"/>
-        </w:rPr>
-        <w:t>2023</w:t>
-      </w:r>
-    </w:p>
-    <w:p>
-      <w:pPr>
-        <w:pStyle w:val="ListParagraph"/>
-        <w:numPr>
-          <w:ilvl w:val="0"/>
-          <w:numId w:val="2"/>
-        </w:numPr>
-        <w:tabs>
-          <w:tab w:val="left" w:pos="861"/>
-        </w:tabs>
-        <w:spacing w:before="2" w:line="218" w:lineRule="exact"/>
-        <w:rPr>
-          <w:rFonts w:ascii="Symbol" w:hAnsi="Symbol"/>
           <w:sz w:val="20"/>
           <w:szCs w:val="24"/>
         </w:rPr>
-      </w:pPr>
-      <w:r>
-        <w:rPr>
-          <w:sz w:val="20"/>
-          <w:szCs w:val="24"/>
-          <w:u w:val="single"/>
-        </w:rPr>
-        <w:t>Client Management</w:t>
-      </w:r>
-      <w:r>
-        <w:rPr>
-          <w:sz w:val="20"/>
-          <w:szCs w:val="24"/>
-        </w:rPr>
-        <w:t xml:space="preserve"> - </w:t>
-      </w:r>
-      <w:r>
-        <w:rPr>
-          <w:sz w:val="20"/>
-          <w:szCs w:val="24"/>
-        </w:rPr>
-        <w:t>Designed and developed a user-friendly booking system for a spa and massage business, streamlining appointment scheduling and client management.</w:t>
-      </w:r>
-    </w:p>
-    <w:p>
-      <w:pPr>
-        <w:pStyle w:val="ListParagraph"/>
-        <w:numPr>
-          <w:ilvl w:val="0"/>
-          <w:numId w:val="2"/>
-        </w:numPr>
-        <w:tabs>
-          <w:tab w:val="left" w:pos="861"/>
-        </w:tabs>
-        <w:spacing w:line="242" w:lineRule="auto"/>
-        <w:ind w:right="458"/>
-        <w:rPr>
-          <w:rFonts w:asciiTheme="majorBidi" w:hAnsiTheme="majorBidi" w:cstheme="majorBidi"/>
-          <w:sz w:val="20"/>
-          <w:szCs w:val="24"/>
-        </w:rPr>
-      </w:pPr>
-      <w:r>
-        <w:rPr>
-          <w:rFonts w:asciiTheme="majorBidi" w:hAnsiTheme="majorBidi" w:cstheme="majorBidi"/>
-          <w:sz w:val="20"/>
-          <w:szCs w:val="24"/>
-          <w:u w:val="single"/>
-        </w:rPr>
-        <w:t>Database Systems</w:t>
-      </w:r>
-      <w:r>
-        <w:rPr>
-          <w:rFonts w:asciiTheme="majorBidi" w:hAnsiTheme="majorBidi" w:cstheme="majorBidi"/>
-          <w:sz w:val="20"/>
-          <w:szCs w:val="24"/>
-        </w:rPr>
-        <w:t xml:space="preserve"> - </w:t>
-      </w:r>
-      <w:r>
-        <w:rPr>
-          <w:rFonts w:asciiTheme="majorBidi" w:hAnsiTheme="majorBidi" w:cstheme="majorBidi"/>
-          <w:sz w:val="20"/>
-          <w:szCs w:val="24"/>
-        </w:rPr>
-        <w:t>Integrated the app with an SQL Server database, ensuring reliable</w:t>
-      </w:r>
-      <w:r>
-        <w:rPr>
-          <w:rFonts w:asciiTheme="majorBidi" w:hAnsiTheme="majorBidi" w:cstheme="majorBidi"/>
-          <w:sz w:val="20"/>
-          <w:szCs w:val="24"/>
-        </w:rPr>
-        <w:t xml:space="preserve"> and secure</w:t>
-      </w:r>
-      <w:r>
-        <w:rPr>
-          <w:rFonts w:asciiTheme="majorBidi" w:hAnsiTheme="majorBidi" w:cstheme="majorBidi"/>
-          <w:sz w:val="20"/>
-          <w:szCs w:val="24"/>
-        </w:rPr>
-        <w:t xml:space="preserve"> data storage and retrieval for client information and bookings.</w:t>
-      </w:r>
-    </w:p>
-    <w:p>
-      <w:pPr>
-        <w:pStyle w:val="ListParagraph"/>
-        <w:numPr>
-          <w:ilvl w:val="0"/>
-          <w:numId w:val="2"/>
-        </w:numPr>
-        <w:tabs>
-          <w:tab w:val="left" w:pos="861"/>
-        </w:tabs>
-        <w:spacing w:line="242" w:lineRule="auto"/>
-        <w:ind w:right="458"/>
-        <w:rPr>
-          <w:rFonts w:asciiTheme="majorBidi" w:hAnsiTheme="majorBidi" w:cstheme="majorBidi"/>
-          <w:sz w:val="20"/>
-          <w:szCs w:val="24"/>
-        </w:rPr>
-      </w:pPr>
-      <w:r>
-        <w:rPr>
-          <w:rFonts w:asciiTheme="majorBidi" w:hAnsiTheme="majorBidi" w:cstheme="majorBidi"/>
-          <w:sz w:val="20"/>
-          <w:szCs w:val="24"/>
-          <w:u w:val="single"/>
-        </w:rPr>
-        <w:t>Authentication Protocols</w:t>
-      </w:r>
-      <w:r>
-        <w:rPr>
-          <w:rFonts w:asciiTheme="majorBidi" w:hAnsiTheme="majorBidi" w:cstheme="majorBidi"/>
-          <w:sz w:val="20"/>
-          <w:szCs w:val="24"/>
-        </w:rPr>
-        <w:t xml:space="preserve"> - </w:t>
-      </w:r>
-      <w:r>
-        <w:rPr>
-          <w:rFonts w:asciiTheme="majorBidi" w:hAnsiTheme="majorBidi" w:cstheme="majorBidi"/>
-          <w:sz w:val="20"/>
-          <w:szCs w:val="24"/>
-        </w:rPr>
-        <w:t>Integrated the app with an industry-standard credential creation system, ensuring secure and efficient user authentication and access control.</w:t>
-      </w:r>
-    </w:p>
-    <w:p>
-      <w:pPr>
-        <w:pStyle w:val="ListParagraph"/>
-        <w:numPr>
-          <w:ilvl w:val="0"/>
-          <w:numId w:val="2"/>
-        </w:numPr>
-        <w:tabs>
-          <w:tab w:val="left" w:pos="861"/>
-        </w:tabs>
-        <w:spacing w:line="242" w:lineRule="auto"/>
-        <w:ind w:right="458"/>
-        <w:rPr>
-          <w:rFonts w:ascii="Symbol" w:hAnsi="Symbol"/>
-          <w:sz w:val="20"/>
-          <w:szCs w:val="24"/>
-        </w:rPr>
-      </w:pPr>
-      <w:r>
-        <w:rPr>
-          <w:sz w:val="20"/>
-          <w:szCs w:val="24"/>
-          <w:u w:val="single"/>
-        </w:rPr>
-        <w:t>Real-Time Updates</w:t>
-      </w:r>
-      <w:r>
-        <w:rPr>
-          <w:sz w:val="20"/>
-          <w:szCs w:val="24"/>
-        </w:rPr>
-        <w:t xml:space="preserve"> - </w:t>
-      </w:r>
-      <w:r>
-        <w:rPr>
-          <w:sz w:val="20"/>
-          <w:szCs w:val="24"/>
-        </w:rPr>
-        <w:t>Created an interactive service menu with real-time availability updates, enhancing the user experience and operational efficiency.</w:t>
-      </w:r>
-    </w:p>
-    <w:p>
-      <w:pPr>
-        <w:spacing w:after="240" w:line="225" w:lineRule="exact"/>
-        <w:jc w:val="center"/>
-        <w:rPr>
-          <w:color w:val="000000" w:themeColor="text1"/>
-          <w:spacing w:val="-2"/>
-          <w:sz w:val="20"/>
-          <w:szCs w:val="20"/>
-        </w:rPr>
-      </w:pPr>
-      <w:hyperlink r:id="rId8" w:history="1">
-        <w:r>
-          <w:rPr>
-            <w:rStyle w:val="Hyperlink"/>
-            <w:spacing w:val="-2"/>
-            <w:sz w:val="20"/>
-            <w:szCs w:val="20"/>
-          </w:rPr>
-          <w:t>https://github.com/Axaerys/AquaSerene</w:t>
-        </w:r>
-      </w:hyperlink>
+        <w:t>. The project utilized tools such as Ganache for local blockchain testing and was integrated with MetaMask for secure wallet interactions.</w:t>
+      </w:r>
     </w:p>
     <w:p>
       <w:pPr>
@@ -1266,240 +1214,31 @@
           <w:sz w:val="20"/>
         </w:rPr>
       </w:pPr>
-      <w:proofErr w:type="spellStart"/>
       <w:r>
         <w:rPr>
           <w:b/>
           <w:spacing w:val="-2"/>
           <w:sz w:val="20"/>
         </w:rPr>
-        <w:t>BlockCore</w:t>
-      </w:r>
-      <w:proofErr w:type="spellEnd"/>
-      <w:r>
-        <w:rPr>
-          <w:b/>
-          <w:spacing w:val="14"/>
-          <w:sz w:val="20"/>
-        </w:rPr>
-        <w:t xml:space="preserve"> </w:t>
-      </w:r>
-      <w:r>
-        <w:rPr>
-          <w:spacing w:val="-2"/>
+        <w:t>Designed a Functional Network Infrastructure for a University Campus</w:t>
+      </w:r>
+    </w:p>
+    <w:p>
+      <w:pPr>
+        <w:spacing w:after="240"/>
+        <w:ind w:left="540"/>
+        <w:rPr>
           <w:sz w:val="20"/>
           <w:szCs w:val="20"/>
         </w:rPr>
-        <w:t>|</w:t>
-      </w:r>
-      <w:r>
-        <w:rPr>
-          <w:spacing w:val="8"/>
+      </w:pPr>
+      <w:r>
+        <w:rPr>
           <w:sz w:val="20"/>
           <w:szCs w:val="20"/>
         </w:rPr>
-        <w:t xml:space="preserve"> </w:t>
-      </w:r>
-      <w:proofErr w:type="spellStart"/>
-      <w:r>
-        <w:rPr>
-          <w:sz w:val="20"/>
-          <w:szCs w:val="20"/>
-        </w:rPr>
-        <w:t>BlockChain</w:t>
-      </w:r>
-      <w:proofErr w:type="spellEnd"/>
-      <w:r>
-        <w:rPr>
-          <w:sz w:val="20"/>
-          <w:szCs w:val="20"/>
-        </w:rPr>
-        <w:t xml:space="preserve"> Storage System</w:t>
-      </w:r>
-      <w:r>
-        <w:rPr>
-          <w:sz w:val="20"/>
-          <w:szCs w:val="20"/>
-        </w:rPr>
-        <w:t xml:space="preserve"> Business </w:t>
-      </w:r>
-      <w:r>
-        <w:rPr>
-          <w:spacing w:val="-2"/>
-          <w:sz w:val="18"/>
-          <w:szCs w:val="20"/>
-        </w:rPr>
-        <w:t>(fictional)</w:t>
-      </w:r>
-      <w:r>
-        <w:rPr>
-          <w:color w:val="0462C1"/>
-          <w:sz w:val="20"/>
-        </w:rPr>
-        <w:tab/>
-      </w:r>
-      <w:r>
-        <w:rPr>
-          <w:sz w:val="20"/>
-        </w:rPr>
-        <w:t>December</w:t>
-      </w:r>
-      <w:r>
-        <w:rPr>
-          <w:spacing w:val="-3"/>
-          <w:sz w:val="20"/>
-        </w:rPr>
-        <w:t xml:space="preserve"> </w:t>
-      </w:r>
-      <w:r>
-        <w:rPr>
-          <w:spacing w:val="-4"/>
-          <w:sz w:val="20"/>
-        </w:rPr>
-        <w:t>2023</w:t>
-      </w:r>
-    </w:p>
-    <w:p>
-      <w:pPr>
-        <w:pStyle w:val="ListParagraph"/>
-        <w:numPr>
-          <w:ilvl w:val="0"/>
-          <w:numId w:val="2"/>
-        </w:numPr>
-        <w:tabs>
-          <w:tab w:val="left" w:pos="861"/>
-        </w:tabs>
-        <w:spacing w:line="242" w:lineRule="auto"/>
-        <w:ind w:right="458"/>
-        <w:rPr>
-          <w:sz w:val="20"/>
-          <w:szCs w:val="20"/>
-        </w:rPr>
-      </w:pPr>
-      <w:r>
-        <w:rPr>
-          <w:sz w:val="20"/>
-          <w:szCs w:val="20"/>
-        </w:rPr>
-        <w:t xml:space="preserve">Designed and developed an </w:t>
-      </w:r>
-      <w:r>
-        <w:rPr>
-          <w:color w:val="000000" w:themeColor="text1"/>
-          <w:sz w:val="20"/>
-          <w:szCs w:val="20"/>
-        </w:rPr>
-        <w:t>intuitive</w:t>
-      </w:r>
-      <w:r>
-        <w:rPr>
-          <w:sz w:val="20"/>
-          <w:szCs w:val="20"/>
-        </w:rPr>
-        <w:t xml:space="preserve"> front-end interface for a blockchain data storage business, ensuring a seamless user experience.</w:t>
-      </w:r>
-    </w:p>
-    <w:p>
-      <w:pPr>
-        <w:pStyle w:val="ListParagraph"/>
-        <w:numPr>
-          <w:ilvl w:val="0"/>
-          <w:numId w:val="2"/>
-        </w:numPr>
-        <w:tabs>
-          <w:tab w:val="left" w:pos="861"/>
-        </w:tabs>
-        <w:spacing w:line="242" w:lineRule="auto"/>
-        <w:ind w:right="458"/>
-        <w:rPr>
-          <w:sz w:val="20"/>
-          <w:szCs w:val="20"/>
-        </w:rPr>
-      </w:pPr>
-      <w:r>
-        <w:rPr>
-          <w:sz w:val="20"/>
-          <w:szCs w:val="20"/>
-        </w:rPr>
-        <w:t>Created dynamic data visualization compo</w:t>
-      </w:r>
-      <w:r>
-        <w:rPr>
-          <w:color w:val="000000" w:themeColor="text1"/>
-          <w:sz w:val="20"/>
-          <w:szCs w:val="20"/>
-        </w:rPr>
-        <w:t>nen</w:t>
-      </w:r>
-      <w:r>
-        <w:rPr>
-          <w:sz w:val="20"/>
-          <w:szCs w:val="20"/>
-        </w:rPr>
-        <w:t>ts to display blockchain data clearly and interactively.</w:t>
-      </w:r>
-    </w:p>
-    <w:p>
-      <w:pPr>
-        <w:pStyle w:val="ListParagraph"/>
-        <w:numPr>
-          <w:ilvl w:val="0"/>
-          <w:numId w:val="2"/>
-        </w:numPr>
-        <w:tabs>
-          <w:tab w:val="left" w:pos="861"/>
-        </w:tabs>
-        <w:spacing w:line="242" w:lineRule="auto"/>
-        <w:ind w:right="458"/>
-        <w:rPr>
-          <w:rFonts w:ascii="Symbol" w:hAnsi="Symbol"/>
-          <w:sz w:val="20"/>
-          <w:szCs w:val="20"/>
-        </w:rPr>
-      </w:pPr>
-      <w:bookmarkStart w:id="0" w:name="_Hlk175841547"/>
-      <w:r>
-        <w:rPr>
-          <w:sz w:val="20"/>
-          <w:szCs w:val="20"/>
-        </w:rPr>
-        <w:t xml:space="preserve">Implemented </w:t>
-      </w:r>
-      <w:bookmarkEnd w:id="0"/>
-      <w:r>
-        <w:rPr>
-          <w:sz w:val="20"/>
-          <w:szCs w:val="20"/>
-        </w:rPr>
-        <w:t>responsive design techniques to ensure compatibility across various devices and screen sizes</w:t>
-      </w:r>
-      <w:r>
-        <w:rPr>
-          <w:sz w:val="20"/>
-          <w:szCs w:val="20"/>
-        </w:rPr>
-        <w:t>.</w:t>
-      </w:r>
-    </w:p>
-    <w:p>
-      <w:pPr>
-        <w:jc w:val="center"/>
-        <w:rPr>
-          <w:rStyle w:val="Hyperlink"/>
-          <w:sz w:val="20"/>
-          <w:szCs w:val="20"/>
-        </w:rPr>
-      </w:pPr>
-      <w:hyperlink r:id="rId9" w:history="1">
-        <w:r>
-          <w:rPr>
-            <w:rStyle w:val="Hyperlink"/>
-            <w:sz w:val="20"/>
-            <w:szCs w:val="20"/>
-          </w:rPr>
-          <w:t>https://github.com/Axaerys/BlockCore</w:t>
-        </w:r>
-      </w:hyperlink>
+        <w:t>Conducted a comprehensive network needs analysis and developed a scalable network topology. The project included cost estimation, creation of a detailed IP addressing schema, implementation of the network using Cisco Packet Tracer, and configuration of routers to ensure efficient connectivity and performance.</w:t>
+      </w:r>
     </w:p>
     <w:p>
       <w:pPr>
@@ -1512,166 +1251,95 @@
           <w:sz w:val="20"/>
         </w:rPr>
       </w:pPr>
-      <w:proofErr w:type="spellStart"/>
       <w:r>
         <w:rPr>
           <w:b/>
           <w:spacing w:val="-2"/>
           <w:sz w:val="20"/>
         </w:rPr>
-        <w:t>Qike</w:t>
-      </w:r>
-      <w:proofErr w:type="spellEnd"/>
-      <w:r>
+        <w:t>Bloom filter using Bi-grams</w:t>
+      </w:r>
+    </w:p>
+    <w:p>
+      <w:pPr>
+        <w:spacing w:after="240"/>
+        <w:ind w:left="540"/>
+      </w:pPr>
+      <w:r>
+        <w:rPr>
+          <w:sz w:val="20"/>
+          <w:szCs w:val="20"/>
+        </w:rPr>
+        <w:t>Utilized Bloom filter efficiency to validate common passwords through bigram index comparison. Enhanced security by applying SHA-256 and MD5 hashing algorithms with randomized salt to securely store user</w:t>
+      </w:r>
+      <w:r>
+        <w:t xml:space="preserve"> passwords.</w:t>
+      </w:r>
+    </w:p>
+    <w:p>
+      <w:pPr>
+        <w:ind w:left="180"/>
         <w:rPr>
           <w:b/>
-          <w:spacing w:val="14"/>
-          <w:sz w:val="20"/>
-        </w:rPr>
-        <w:t xml:space="preserve"> </w:t>
-      </w:r>
-      <w:r>
-        <w:rPr>
-          <w:spacing w:val="-2"/>
+          <w:bCs/>
           <w:sz w:val="20"/>
           <w:szCs w:val="20"/>
         </w:rPr>
-        <w:t>|</w:t>
-      </w:r>
-      <w:r>
-        <w:rPr>
-          <w:spacing w:val="8"/>
+      </w:pPr>
+      <w:r>
+        <w:rPr>
+          <w:b/>
+          <w:bCs/>
           <w:sz w:val="20"/>
           <w:szCs w:val="20"/>
         </w:rPr>
-        <w:t xml:space="preserve"> </w:t>
-      </w:r>
-      <w:r>
-        <w:rPr>
+        <w:t>Privilege Escalation Cyber</w:t>
+      </w:r>
+      <w:r>
+        <w:rPr>
+          <w:b/>
+          <w:bCs/>
           <w:sz w:val="20"/>
           <w:szCs w:val="20"/>
         </w:rPr>
-        <w:t>Modern Footwear Brand (fictional)</w:t>
-      </w:r>
-      <w:r>
-        <w:rPr>
-          <w:color w:val="0462C1"/>
-          <w:sz w:val="20"/>
-        </w:rPr>
-        <w:tab/>
-      </w:r>
-      <w:r>
-        <w:rPr>
-          <w:sz w:val="20"/>
-        </w:rPr>
-        <w:t>August 2024</w:t>
-      </w:r>
-    </w:p>
-    <w:p>
-      <w:pPr>
-        <w:pStyle w:val="ListParagraph"/>
-        <w:numPr>
-          <w:ilvl w:val="0"/>
-          <w:numId w:val="2"/>
-        </w:numPr>
-        <w:tabs>
-          <w:tab w:val="left" w:pos="861"/>
-        </w:tabs>
-        <w:spacing w:line="242" w:lineRule="auto"/>
-        <w:ind w:right="458"/>
-        <w:rPr>
+        <w:t>-</w:t>
+      </w:r>
+      <w:r>
+        <w:rPr>
+          <w:b/>
+          <w:bCs/>
           <w:sz w:val="20"/>
           <w:szCs w:val="20"/>
         </w:rPr>
-      </w:pPr>
-      <w:r>
-        <w:rPr>
+        <w:t>Attack Simulation</w:t>
+      </w:r>
+    </w:p>
+    <w:p>
+      <w:pPr>
+        <w:spacing w:after="240"/>
+        <w:ind w:left="540"/>
+        <w:rPr>
+          <w:rStyle w:val="Hyperlink"/>
+          <w:color w:val="000000" w:themeColor="text1"/>
           <w:sz w:val="20"/>
           <w:szCs w:val="20"/>
-        </w:rPr>
-        <w:t xml:space="preserve">Designed and developed an engaging front-end interface for a Nike-inspired fictional footwear brand, focusing on sleek, modern design principles. </w:t>
-      </w:r>
-    </w:p>
-    <w:p>
-      <w:pPr>
-        <w:pStyle w:val="ListParagraph"/>
-        <w:numPr>
-          <w:ilvl w:val="0"/>
-          <w:numId w:val="2"/>
-        </w:numPr>
-        <w:tabs>
-          <w:tab w:val="left" w:pos="861"/>
-        </w:tabs>
-        <w:spacing w:line="242" w:lineRule="auto"/>
-        <w:ind w:right="458"/>
-        <w:rPr>
-          <w:sz w:val="20"/>
-          <w:szCs w:val="20"/>
-        </w:rPr>
-      </w:pPr>
-      <w:r>
-        <w:rPr>
-          <w:sz w:val="20"/>
-          <w:szCs w:val="20"/>
-        </w:rPr>
-        <w:t>Integrated dynamic product displays and animations to enhance user interaction and promote footwear features effectively.</w:t>
-      </w:r>
-    </w:p>
-    <w:p>
-      <w:pPr>
-        <w:pStyle w:val="ListParagraph"/>
-        <w:numPr>
-          <w:ilvl w:val="0"/>
-          <w:numId w:val="2"/>
-        </w:numPr>
-        <w:tabs>
-          <w:tab w:val="left" w:pos="861"/>
-        </w:tabs>
-        <w:spacing w:line="242" w:lineRule="auto"/>
-        <w:ind w:right="458"/>
-        <w:rPr>
-          <w:sz w:val="20"/>
-          <w:szCs w:val="20"/>
-        </w:rPr>
-      </w:pPr>
-      <w:r>
-        <w:rPr>
-          <w:sz w:val="20"/>
-          <w:szCs w:val="20"/>
-        </w:rPr>
-        <w:t>Implemented responsive design techniques to ensure a consistent and stylish user experience across all devices and screen sizes.</w:t>
-      </w:r>
-    </w:p>
-    <w:p>
-      <w:pPr>
-        <w:spacing w:after="240"/>
-        <w:jc w:val="center"/>
-      </w:pPr>
-      <w:hyperlink r:id="rId10" w:history="1">
-        <w:r>
-          <w:rPr>
-            <w:rStyle w:val="Hyperlink"/>
-            <w:sz w:val="20"/>
-            <w:szCs w:val="20"/>
-          </w:rPr>
-          <w:t>https://github.com/Axaerys/Qike</w:t>
-        </w:r>
-      </w:hyperlink>
-    </w:p>
-    <w:p>
-      <w:pPr>
-        <w:jc w:val="center"/>
-        <w:rPr>
-          <w:rStyle w:val="Hyperlink"/>
-          <w:sz w:val="13"/>
+          <w:u w:val="none"/>
         </w:rPr>
         <w:sectPr>
           <w:type w:val="continuous"/>
           <w:pgSz w:w="12240" w:h="15840"/>
-          <w:pgMar w:top="1360" w:right="1300" w:bottom="280" w:left="1300" w:header="720" w:footer="720" w:gutter="0"/>
+          <w:pgMar w:top="270" w:right="1300" w:bottom="280" w:left="1300" w:header="720" w:footer="720" w:gutter="0"/>
           <w:cols w:space="720"/>
         </w:sectPr>
       </w:pPr>
+      <w:r>
+        <w:rPr>
+          <w:color w:val="000000" w:themeColor="text1"/>
+          <w:sz w:val="20"/>
+          <w:szCs w:val="20"/>
+        </w:rPr>
+        <w:t>Simulated a privilege escalation cyber-attack by leveraging passive exploitation techniques. The attack targeted system vulnerabilities, misconfigurations, or weak access controls on the victim’s machine, ultimately achieving unauthorized root-level access from a lower-privilege user perspective.</w:t>
+      </w:r>
       <w:r>
         <w:rPr>
           <w:sz w:val="20"/>
@@ -1824,7 +1492,7 @@
           </mc:Choice>
           <mc:Fallback>
             <w:pict>
-              <v:group w14:anchorId="53A8A92F" id="Group 4" o:spid="_x0000_s1026" style="width:219pt;height:1.45pt;mso-position-horizontal-relative:char;mso-position-vertical-relative:line" coordsize="27813,184" o:gfxdata="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">
+              <v:group w14:anchorId="365110A3" id="Group 4" o:spid="_x0000_s1026" style="width:219pt;height:1.45pt;mso-position-horizontal-relative:char;mso-position-vertical-relative:line" coordsize="27813,184" o:gfxdata="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">
                 <v:shape id="Graphic 5" o:spid="_x0000_s1027" style="position:absolute;width:27813;height:184;visibility:visible;mso-wrap-style:square;v-text-anchor:top" coordsize="2781300,18415" o:gfxdata="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" path="m2781300,l,,,18287r2781300,l2781300,xe" fillcolor="black" stroked="f">
                   <v:path arrowok="t"/>
                 </v:shape>
@@ -1853,9 +1521,47 @@
       </w:pPr>
       <w:r>
         <w:rPr>
+          <w:b/>
+          <w:bCs/>
+          <w:sz w:val="20"/>
+        </w:rPr>
+        <w:t>Languages:</w:t>
+      </w:r>
+      <w:r>
+        <w:rPr>
+          <w:sz w:val="20"/>
+        </w:rPr>
+        <w:t xml:space="preserve"> </w:t>
+      </w:r>
+      <w:r>
+        <w:rPr>
           <w:sz w:val="20"/>
         </w:rPr>
         <w:t>HTML, CSS, JavaScript, TypeScript</w:t>
+      </w:r>
+      <w:r>
+        <w:rPr>
+          <w:sz w:val="20"/>
+        </w:rPr>
+        <w:t xml:space="preserve">, Java, C, C++, C#, </w:t>
+      </w:r>
+      <w:r>
+        <w:rPr>
+          <w:sz w:val="20"/>
+        </w:rPr>
+        <w:t xml:space="preserve">NodeJS, </w:t>
+      </w:r>
+      <w:r>
+        <w:rPr>
+          <w:sz w:val="20"/>
+        </w:rPr>
+        <w:t>Python</w:t>
+      </w:r>
+      <w:r>
+        <w:rPr>
+          <w:sz w:val="20"/>
+        </w:rPr>
+        <w:t>, Bash, Machine Code</w:t>
       </w:r>
     </w:p>
     <w:p>
@@ -1876,6 +1582,20 @@
       </w:pPr>
       <w:r>
         <w:rPr>
+          <w:b/>
+          <w:bCs/>
+          <w:sz w:val="20"/>
+        </w:rPr>
+        <w:t>Frameworks:</w:t>
+      </w:r>
+      <w:r>
+        <w:rPr>
+          <w:sz w:val="20"/>
+        </w:rPr>
+        <w:t xml:space="preserve"> Unix CLI, </w:t>
+      </w:r>
+      <w:r>
+        <w:rPr>
           <w:sz w:val="20"/>
         </w:rPr>
         <w:t xml:space="preserve">ReactJS, </w:t>
@@ -1888,6 +1608,24 @@
         <w:t>NextJS</w:t>
       </w:r>
       <w:proofErr w:type="spellEnd"/>
+      <w:r>
+        <w:rPr>
+          <w:sz w:val="20"/>
+        </w:rPr>
+        <w:t>, React</w:t>
+      </w:r>
+      <w:r>
+        <w:rPr>
+          <w:sz w:val="20"/>
+        </w:rPr>
+        <w:t xml:space="preserve"> </w:t>
+      </w:r>
+      <w:r>
+        <w:rPr>
+          <w:sz w:val="20"/>
+        </w:rPr>
+        <w:t>Native</w:t>
+      </w:r>
     </w:p>
     <w:p>
       <w:pPr>
@@ -1899,8 +1637,6 @@
         <w:tabs>
           <w:tab w:val="left" w:pos="861"/>
         </w:tabs>
-        <w:spacing w:before="1"/>
-        <w:ind w:right="38"/>
         <w:rPr>
           <w:rFonts w:ascii="Symbol" w:hAnsi="Symbol"/>
           <w:sz w:val="20"/>
@@ -1908,9 +1644,31 @@
       </w:pPr>
       <w:r>
         <w:rPr>
-          <w:sz w:val="20"/>
-        </w:rPr>
-        <w:t>Bootstrap, Tailwind CSS</w:t>
+          <w:b/>
+          <w:bCs/>
+          <w:sz w:val="20"/>
+        </w:rPr>
+        <w:t>Query Languages:</w:t>
+      </w:r>
+      <w:r>
+        <w:rPr>
+          <w:sz w:val="20"/>
+        </w:rPr>
+        <w:t xml:space="preserve"> </w:t>
+      </w:r>
+      <w:r>
+        <w:rPr>
+          <w:spacing w:val="-2"/>
+          <w:sz w:val="20"/>
+        </w:rPr>
+        <w:t>MongoDB, MySQL, SQLite</w:t>
+      </w:r>
+      <w:r>
+        <w:rPr>
+          <w:spacing w:val="-2"/>
+          <w:sz w:val="20"/>
+        </w:rPr>
+        <w:t>, Oracle PL/SQL</w:t>
       </w:r>
     </w:p>
     <w:p>
@@ -1930,40 +1688,29 @@
       </w:pPr>
       <w:r>
         <w:rPr>
-          <w:spacing w:val="-2"/>
-          <w:sz w:val="20"/>
-        </w:rPr>
-        <w:t>MongoDB, MySQL, SQLite</w:t>
-      </w:r>
-    </w:p>
-    <w:p>
-      <w:pPr>
-        <w:pStyle w:val="ListParagraph"/>
-        <w:numPr>
-          <w:ilvl w:val="0"/>
-          <w:numId w:val="2"/>
-        </w:numPr>
-        <w:tabs>
-          <w:tab w:val="left" w:pos="861"/>
-        </w:tabs>
-        <w:rPr>
-          <w:rFonts w:ascii="Symbol" w:hAnsi="Symbol"/>
-          <w:sz w:val="20"/>
-        </w:rPr>
-      </w:pPr>
-      <w:r>
-        <w:rPr>
-          <w:spacing w:val="-2"/>
-          <w:sz w:val="20"/>
-        </w:rPr>
-        <w:t xml:space="preserve">Java, </w:t>
-      </w:r>
-      <w:r>
-        <w:rPr>
-          <w:spacing w:val="-2"/>
-          <w:sz w:val="20"/>
-        </w:rPr>
-        <w:t>NodeJS</w:t>
+          <w:b/>
+          <w:bCs/>
+          <w:sz w:val="20"/>
+        </w:rPr>
+        <w:t xml:space="preserve">Skills: </w:t>
+      </w:r>
+      <w:r>
+        <w:rPr>
+          <w:sz w:val="20"/>
+        </w:rPr>
+        <w:t>Kali Linux Pen</w:t>
+      </w:r>
+      <w:r>
+        <w:rPr>
+          <w:sz w:val="20"/>
+        </w:rPr>
+        <w:t>-T</w:t>
+      </w:r>
+      <w:r>
+        <w:rPr>
+          <w:sz w:val="20"/>
+        </w:rPr>
+        <w:t>esting, Packet Tracer, Project Management Body of Knowledge (PMBOK)</w:t>
       </w:r>
     </w:p>
     <w:p>
@@ -2077,7 +1824,7 @@
           </mc:Choice>
           <mc:Fallback>
             <w:pict>
-              <v:group w14:anchorId="0C2DE48A" id="Group 6" o:spid="_x0000_s1026" style="width:219.05pt;height:1.45pt;mso-position-horizontal-relative:char;mso-position-vertical-relative:line" coordsize="27819,184" o:gfxdata="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">
+              <v:group w14:anchorId="6B547494" id="Group 6" o:spid="_x0000_s1026" style="width:219.05pt;height:1.45pt;mso-position-horizontal-relative:char;mso-position-vertical-relative:line" coordsize="27819,184" o:gfxdata="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">
                 <v:shape id="Graphic 7" o:spid="_x0000_s1027" style="position:absolute;width:27819;height:184;visibility:visible;mso-wrap-style:square;v-text-anchor:top" coordsize="2781935,18415" o:gfxdata="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" path="m2781554,l,,,18287r2781554,l2781554,xe" fillcolor="black" stroked="f">
                   <v:path arrowok="t"/>
                 </v:shape>
@@ -2204,6 +1951,30 @@
         <w:tabs>
           <w:tab w:val="left" w:pos="860"/>
         </w:tabs>
+        <w:spacing w:before="1"/>
+        <w:ind w:left="860" w:right="840" w:hanging="360"/>
+        <w:rPr>
+          <w:rFonts w:ascii="Symbol" w:hAnsi="Symbol"/>
+          <w:sz w:val="20"/>
+        </w:rPr>
+      </w:pPr>
+      <w:r>
+        <w:rPr>
+          <w:sz w:val="20"/>
+        </w:rPr>
+        <w:t>Financial Knowledge</w:t>
+      </w:r>
+    </w:p>
+    <w:p>
+      <w:pPr>
+        <w:pStyle w:val="ListParagraph"/>
+        <w:numPr>
+          <w:ilvl w:val="0"/>
+          <w:numId w:val="2"/>
+        </w:numPr>
+        <w:tabs>
+          <w:tab w:val="left" w:pos="860"/>
+        </w:tabs>
         <w:ind w:left="860" w:hanging="360"/>
         <w:rPr>
           <w:rFonts w:ascii="Symbol" w:hAnsi="Symbol"/>
@@ -2273,6 +2044,7 @@
     <w:p>
       <w:pPr>
         <w:pStyle w:val="Heading1"/>
+        <w:spacing w:line="276" w:lineRule="auto"/>
       </w:pPr>
       <w:r>
         <w:rPr>
@@ -2352,7 +2124,7 @@
           </mc:Choice>
           <mc:Fallback>
             <w:pict>
-              <v:shape w14:anchorId="60E4361B" id="Graphic 10" o:spid="_x0000_s1026" style="position:absolute;margin-left:70.6pt;margin-top:12.25pt;width:471.2pt;height:1.45pt;z-index:15731200;visibility:visible;mso-wrap-style:square;mso-wrap-distance-left:0;mso-wrap-distance-top:0;mso-wrap-distance-right:0;mso-wrap-distance-bottom:0;mso-position-horizontal:absolute;mso-position-horizontal-relative:page;mso-position-vertical:absolute;mso-position-vertical-relative:text;v-text-anchor:top" coordsize="5984240,18415" o:gfxdata="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" path="m5983859,l,,,18288r5983859,l5983859,xe" fillcolor="black" stroked="f">
+              <v:shape w14:anchorId="7D1AE70A" id="Graphic 10" o:spid="_x0000_s1026" style="position:absolute;margin-left:70.6pt;margin-top:12.25pt;width:471.2pt;height:1.45pt;z-index:15731200;visibility:visible;mso-wrap-style:square;mso-wrap-distance-left:0;mso-wrap-distance-top:0;mso-wrap-distance-right:0;mso-wrap-distance-bottom:0;mso-position-horizontal:absolute;mso-position-horizontal-relative:page;mso-position-vertical:absolute;mso-position-vertical-relative:text;v-text-anchor:top" coordsize="5984240,18415" o:gfxdata="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" path="m5983859,l,,,18288r5983859,l5983859,xe" fillcolor="black" stroked="f">
                 <v:path arrowok="t"/>
                 <w10:wrap anchorx="page"/>
               </v:shape>
@@ -2388,7 +2160,7 @@
         </w:numPr>
         <w:tabs>
           <w:tab w:val="left" w:pos="594"/>
-          <w:tab w:val="left" w:pos="7755"/>
+          <w:tab w:val="left" w:pos="7830"/>
         </w:tabs>
         <w:rPr>
           <w:sz w:val="20"/>
@@ -2475,10 +2247,53 @@
       </w:r>
       <w:r>
         <w:rPr>
+          <w:sz w:val="20"/>
+        </w:rPr>
+        <w:t xml:space="preserve"> </w:t>
+      </w:r>
+      <w:r>
+        <w:rPr>
           <w:spacing w:val="-2"/>
           <w:sz w:val="20"/>
         </w:rPr>
         <w:t>2020,2021,2022,2023</w:t>
+      </w:r>
+    </w:p>
+    <w:p>
+      <w:pPr>
+        <w:pStyle w:val="ListParagraph"/>
+        <w:numPr>
+          <w:ilvl w:val="0"/>
+          <w:numId w:val="1"/>
+        </w:numPr>
+        <w:tabs>
+          <w:tab w:val="left" w:pos="594"/>
+          <w:tab w:val="left" w:pos="9180"/>
+        </w:tabs>
+        <w:rPr>
+          <w:sz w:val="20"/>
+        </w:rPr>
+      </w:pPr>
+      <w:r>
+        <w:rPr>
+          <w:spacing w:val="-2"/>
+          <w:sz w:val="20"/>
+        </w:rPr>
+        <w:t>Written Information Security Program (WISP) Certificate</w:t>
+      </w:r>
+      <w:r>
+        <w:rPr>
+          <w:spacing w:val="-2"/>
+          <w:sz w:val="20"/>
+        </w:rPr>
+        <w:tab/>
+      </w:r>
+      <w:r>
+        <w:rPr>
+          <w:spacing w:val="-2"/>
+          <w:sz w:val="20"/>
+        </w:rPr>
+        <w:t>2022</w:t>
       </w:r>
     </w:p>
     <w:sectPr>
@@ -2492,7 +2307,7 @@
 </file>
 
 <file path=word/numbering.xml><?xml version="1.0" encoding="utf-8"?>
-<w:numbering xmlns:wpc="http://schemas.microsoft.com/office/word/2010/wordprocessingCanvas" xmlns:cx="http://schemas.microsoft.com/office/drawing/2014/chartex" xmlns:cx1="http://schemas.microsoft.com/office/drawing/2015/9/8/chartex" xmlns:cx2="http://schemas.microsoft.com/office/drawing/2015/10/21/chartex" xmlns:cx3="http://schemas.microsoft.com/office/drawing/2016/5/9/chartex" xmlns:cx4="http://schemas.microsoft.com/office/drawing/2016/5/10/chartex" xmlns:cx5="http://schemas.microsoft.com/office/drawing/2016/5/11/chartex" xmlns:cx6="http://schemas.microsoft.com/office/drawing/2016/5/12/chartex" xmlns:cx7="http://schemas.microsoft.com/office/drawing/2016/5/13/chartex" xmlns:cx8="http://schemas.microsoft.com/office/drawing/2016/5/14/chartex" xmlns:mc="http://schemas.openxmlformats.org/markup-compatibility/2006" xmlns:aink="http://schemas.microsoft.com/office/drawing/2016/ink" xmlns:am3d="http://schemas.microsoft.com/office/drawing/2017/model3d" xmlns:o="urn:schemas-microsoft-com:office:office" xmlns:oel="http://schemas.microsoft.com/office/2019/extlst" xmlns:r="http://schemas.openxmlformats.org/officeDocument/2006/relationships" xmlns:m="http://schemas.openxmlformats.org/officeDocument/2006/math" xmlns:v="urn:schemas-microsoft-com:vml" xmlns:wp14="http://schemas.microsoft.com/office/word/2010/wordprocessingDrawing" xmlns:wp="http://schemas.openxmlformats.org/drawingml/2006/wordprocessingDrawing" xmlns:w10="urn:schemas-microsoft-com:office:word" xmlns:w="http://schemas.openxmlformats.org/wordprocessingml/2006/main" xmlns:w14="http://schemas.microsoft.com/office/word/2010/wordml" xmlns:w15="http://schemas.microsoft.com/office/word/2012/wordml" xmlns:w16cex="http://schemas.microsoft.com/office/word/2018/wordml/cex" xmlns:w16cid="http://schemas.microsoft.com/office/word/2016/wordml/cid" xmlns:w16="http://schemas.microsoft.com/office/word/2018/wordml" xmlns:w16du="http://schemas.microsoft.com/office/word/2023/wordml/word16du" xmlns:w16sdtdh="http://schemas.microsoft.com/office/word/2020/wordml/sdtdatahash" xmlns:w16se="http://schemas.microsoft.com/office/word/2015/wordml/symex" xmlns:wpg="http://schemas.microsoft.com/office/word/2010/wordprocessingGroup" xmlns:wpi="http://schemas.microsoft.com/office/word/2010/wordprocessingInk" xmlns:wne="http://schemas.microsoft.com/office/word/2006/wordml" xmlns:wps="http://schemas.microsoft.com/office/word/2010/wordprocessingShape" mc:Ignorable="w14 w15 w16se w16cid w16 w16cex w16sdtdh w16du wp14">
+<w:numbering xmlns:wpc="http://schemas.microsoft.com/office/word/2010/wordprocessingCanvas" xmlns:cx="http://schemas.microsoft.com/office/drawing/2014/chartex" xmlns:cx1="http://schemas.microsoft.com/office/drawing/2015/9/8/chartex" xmlns:cx2="http://schemas.microsoft.com/office/drawing/2015/10/21/chartex" xmlns:cx3="http://schemas.microsoft.com/office/drawing/2016/5/9/chartex" xmlns:cx4="http://schemas.microsoft.com/office/drawing/2016/5/10/chartex" xmlns:cx5="http://schemas.microsoft.com/office/drawing/2016/5/11/chartex" xmlns:cx6="http://schemas.microsoft.com/office/drawing/2016/5/12/chartex" xmlns:cx7="http://schemas.microsoft.com/office/drawing/2016/5/13/chartex" xmlns:cx8="http://schemas.microsoft.com/office/drawing/2016/5/14/chartex" xmlns:mc="http://schemas.openxmlformats.org/markup-compatibility/2006" xmlns:aink="http://schemas.microsoft.com/office/drawing/2016/ink" xmlns:am3d="http://schemas.microsoft.com/office/drawing/2017/model3d" xmlns:o="urn:schemas-microsoft-com:office:office" xmlns:oel="http://schemas.microsoft.com/office/2019/extlst" xmlns:r="http://schemas.openxmlformats.org/officeDocument/2006/relationships" xmlns:m="http://schemas.openxmlformats.org/officeDocument/2006/math" xmlns:v="urn:schemas-microsoft-com:vml" xmlns:wp14="http://schemas.microsoft.com/office/word/2010/wordprocessingDrawing" xmlns:wp="http://schemas.openxmlformats.org/drawingml/2006/wordprocessingDrawing" xmlns:w10="urn:schemas-microsoft-com:office:word" xmlns:w="http://schemas.openxmlformats.org/wordprocessingml/2006/main" xmlns:w14="http://schemas.microsoft.com/office/word/2010/wordml" xmlns:w15="http://schemas.microsoft.com/office/word/2012/wordml" xmlns:w16cex="http://schemas.microsoft.com/office/word/2018/wordml/cex" xmlns:w16cid="http://schemas.microsoft.com/office/word/2016/wordml/cid" xmlns:w16="http://schemas.microsoft.com/office/word/2018/wordml" xmlns:w16du="http://schemas.microsoft.com/office/word/2023/wordml/word16du" xmlns:w16sdtdh="http://schemas.microsoft.com/office/word/2020/wordml/sdtdatahash" xmlns:w16sdtfl="http://schemas.microsoft.com/office/word/2024/wordml/sdtformatlock" xmlns:w16se="http://schemas.microsoft.com/office/word/2015/wordml/symex" xmlns:wpg="http://schemas.microsoft.com/office/word/2010/wordprocessingGroup" xmlns:wpi="http://schemas.microsoft.com/office/word/2010/wordprocessingInk" xmlns:wne="http://schemas.microsoft.com/office/word/2006/wordml" xmlns:wps="http://schemas.microsoft.com/office/word/2010/wordprocessingShape" mc:Ignorable="w14 w15 w16se w16cid w16 w16cex w16sdtdh w16sdtfl w16du wp14">
   <w:abstractNum w:abstractNumId="0" w15:restartNumberingAfterBreak="0">
     <w:nsid w:val="06406A62"/>
     <w:multiLevelType w:val="hybridMultilevel"/>
@@ -2739,7 +2554,7 @@
 </file>
 
 <file path=word/styles.xml><?xml version="1.0" encoding="utf-8"?>
-<w:styles xmlns:mc="http://schemas.openxmlformats.org/markup-compatibility/2006" xmlns:r="http://schemas.openxmlformats.org/officeDocument/2006/relationships" xmlns:w="http://schemas.openxmlformats.org/wordprocessingml/2006/main" xmlns:w14="http://schemas.microsoft.com/office/word/2010/wordml" xmlns:w15="http://schemas.microsoft.com/office/word/2012/wordml" xmlns:w16cex="http://schemas.microsoft.com/office/word/2018/wordml/cex" xmlns:w16cid="http://schemas.microsoft.com/office/word/2016/wordml/cid" xmlns:w16="http://schemas.microsoft.com/office/word/2018/wordml" xmlns:w16du="http://schemas.microsoft.com/office/word/2023/wordml/word16du" xmlns:w16sdtdh="http://schemas.microsoft.com/office/word/2020/wordml/sdtdatahash" xmlns:w16se="http://schemas.microsoft.com/office/word/2015/wordml/symex" mc:Ignorable="w14 w15 w16se w16cid w16 w16cex w16sdtdh w16du">
+<w:styles xmlns:mc="http://schemas.openxmlformats.org/markup-compatibility/2006" xmlns:r="http://schemas.openxmlformats.org/officeDocument/2006/relationships" xmlns:w="http://schemas.openxmlformats.org/wordprocessingml/2006/main" xmlns:w14="http://schemas.microsoft.com/office/word/2010/wordml" xmlns:w15="http://schemas.microsoft.com/office/word/2012/wordml" xmlns:w16cex="http://schemas.microsoft.com/office/word/2018/wordml/cex" xmlns:w16cid="http://schemas.microsoft.com/office/word/2016/wordml/cid" xmlns:w16="http://schemas.microsoft.com/office/word/2018/wordml" xmlns:w16du="http://schemas.microsoft.com/office/word/2023/wordml/word16du" xmlns:w16sdtdh="http://schemas.microsoft.com/office/word/2020/wordml/sdtdatahash" xmlns:w16sdtfl="http://schemas.microsoft.com/office/word/2024/wordml/sdtformatlock" xmlns:w16se="http://schemas.microsoft.com/office/word/2015/wordml/symex" mc:Ignorable="w14 w15 w16se w16cid w16 w16cex w16sdtdh w16sdtfl w16du">
   <w:docDefaults>
     <w:rPrDefault>
       <w:rPr>

</xml_diff>